<commit_message>
Docs: Menambahkan Daftar Isi (TOC) otomatis ke dalam dokumen Word
</commit_message>
<xml_diff>
--- a/Laporan_UAS_SIAKAD_Final.docx
+++ b/Laporan_UAS_SIAKAD_Final.docx
@@ -42,6 +42,28 @@
         <w:br/>
         <w:t>3. [Nama Anggota 3] - [NIM]</w:t>
         <w:br/>
+      </w:r>
+    </w:p>
+    <w:p>
+      <w:r>
+        <w:br w:type="page"/>
+      </w:r>
+    </w:p>
+    <w:p>
+      <w:pPr>
+        <w:pStyle w:val="Heading1"/>
+        <w:jc w:val="center"/>
+      </w:pPr>
+      <w:r>
+        <w:t>DAFTAR ISI</w:t>
+      </w:r>
+    </w:p>
+    <w:p>
+      <w:r>
+        <w:fldChar w:fldCharType="begin"/>
+        <w:instrText xml:space="preserve">TOC \o "1-3" \h \z \u</w:instrText>
+        <w:fldChar w:fldCharType="separate"/>
+        <w:fldChar w:fldCharType="end"/>
       </w:r>
     </w:p>
     <w:p>

</xml_diff>